<commit_message>
update new contract with 2.6.14
</commit_message>
<xml_diff>
--- a/frontend/src/廠商投標表單(開口)/[開口契約]搶修搶險開口契約工程會1140904版.docx
+++ b/frontend/src/廠商投標表單(開口)/[開口契約]搶修搶險開口契約工程會1140904版.docx
@@ -1563,8 +1563,6 @@
         </w:rPr>
         <w:t>投標文件及其變更或補充。</w:t>
       </w:r>
-      <w:bookmarkStart w:id="0" w:name="_GoBack"/>
-      <w:bookmarkEnd w:id="0"/>
     </w:p>
     <w:p>
       <w:pPr>
@@ -12353,11 +12351,11 @@
       </w:r>
       <w:smartTag w:uri="urn:schemas-microsoft-com:office:smarttags" w:element="chsdate">
         <w:smartTagPr>
+          <w:attr w:name="Year" w:val="1997"/>
+          <w:attr w:name="Month" w:val="7"/>
+          <w:attr w:name="Day" w:val="1"/>
+          <w:attr w:name="IsLunarDate" w:val="False"/>
           <w:attr w:name="IsROCDate" w:val="False"/>
-          <w:attr w:name="IsLunarDate" w:val="False"/>
-          <w:attr w:name="Day" w:val="1"/>
-          <w:attr w:name="Month" w:val="7"/>
-          <w:attr w:name="Year" w:val="1997"/>
         </w:smartTagPr>
         <w:r>
           <w:rPr>
@@ -12376,11 +12374,11 @@
       </w:r>
       <w:smartTag w:uri="urn:schemas-microsoft-com:office:smarttags" w:element="chsdate">
         <w:smartTagPr>
+          <w:attr w:name="Year" w:val="1998"/>
+          <w:attr w:name="Month" w:val="4"/>
+          <w:attr w:name="Day" w:val="7"/>
+          <w:attr w:name="IsLunarDate" w:val="False"/>
           <w:attr w:name="IsROCDate" w:val="False"/>
-          <w:attr w:name="IsLunarDate" w:val="False"/>
-          <w:attr w:name="Day" w:val="7"/>
-          <w:attr w:name="Month" w:val="4"/>
-          <w:attr w:name="Year" w:val="1998"/>
         </w:smartTagPr>
         <w:r>
           <w:rPr>
@@ -13885,8 +13883,8 @@
         </w:rPr>
         <w:t>元（由機關於招標時載明，</w:t>
       </w:r>
-      <w:bookmarkStart w:id="1" w:name="_Hlk185686023"/>
-      <w:bookmarkStart w:id="2" w:name="_Hlk185685891"/>
+      <w:bookmarkStart w:id="0" w:name="_Hlk185686023"/>
+      <w:bookmarkStart w:id="1" w:name="_Hlk185685891"/>
       <w:r>
         <w:rPr>
           <w:rFonts w:ascii="標楷體" w:hAnsi="標楷體" w:hint="eastAsia"/>
@@ -13896,7 +13894,7 @@
         </w:rPr>
         <w:t>應高於最低工資1.1倍；如載明數額未高於1.1倍者，該約定無效，其數額為最低工資1.1倍，未載明者亦同</w:t>
       </w:r>
-      <w:bookmarkEnd w:id="1"/>
+      <w:bookmarkEnd w:id="0"/>
       <w:r>
         <w:rPr>
           <w:rFonts w:ascii="標楷體" w:hAnsi="標楷體" w:hint="eastAsia"/>
@@ -13932,7 +13930,7 @@
         </w:rPr>
         <w:t>款辦理變更</w:t>
       </w:r>
-      <w:bookmarkEnd w:id="2"/>
+      <w:bookmarkEnd w:id="1"/>
       <w:r>
         <w:rPr>
           <w:rFonts w:ascii="標楷體" w:cs="標楷體" w:hint="eastAsia"/>
@@ -15023,12 +15021,12 @@
       </w:r>
       <w:smartTag w:uri="urn:schemas-microsoft-com:office:smarttags" w:element="chmetcnv">
         <w:smartTagPr>
+          <w:attr w:name="UnitName" w:val="立方公尺"/>
+          <w:attr w:name="SourceValue" w:val="2000"/>
+          <w:attr w:name="HasSpace" w:val="False"/>
+          <w:attr w:name="Negative" w:val="False"/>
+          <w:attr w:name="NumberType" w:val="1"/>
           <w:attr w:name="TCSC" w:val="0"/>
-          <w:attr w:name="NumberType" w:val="1"/>
-          <w:attr w:name="Negative" w:val="False"/>
-          <w:attr w:name="HasSpace" w:val="False"/>
-          <w:attr w:name="SourceValue" w:val="2000"/>
-          <w:attr w:name="UnitName" w:val="立方公尺"/>
         </w:smartTagPr>
         <w:r>
           <w:rPr>
@@ -15065,12 +15063,12 @@
       </w:r>
       <w:smartTag w:uri="urn:schemas-microsoft-com:office:smarttags" w:element="chmetcnv">
         <w:smartTagPr>
+          <w:attr w:name="UnitName" w:val="立方公尺"/>
+          <w:attr w:name="SourceValue" w:val="1000"/>
+          <w:attr w:name="HasSpace" w:val="False"/>
+          <w:attr w:name="Negative" w:val="False"/>
+          <w:attr w:name="NumberType" w:val="1"/>
           <w:attr w:name="TCSC" w:val="0"/>
-          <w:attr w:name="NumberType" w:val="1"/>
-          <w:attr w:name="Negative" w:val="False"/>
-          <w:attr w:name="HasSpace" w:val="False"/>
-          <w:attr w:name="SourceValue" w:val="1000"/>
-          <w:attr w:name="UnitName" w:val="立方公尺"/>
         </w:smartTagPr>
         <w:r>
           <w:rPr>
@@ -19576,12 +19574,12 @@
       </w:r>
       <w:smartTag w:uri="urn:schemas-microsoft-com:office:smarttags" w:element="chmetcnv">
         <w:smartTagPr>
+          <w:attr w:name="TCSC" w:val="0"/>
+          <w:attr w:name="NumberType" w:val="1"/>
+          <w:attr w:name="Negative" w:val="False"/>
+          <w:attr w:name="HasSpace" w:val="False"/>
+          <w:attr w:name="SourceValue" w:val="20"/>
           <w:attr w:name="UnitName" w:val="公里"/>
-          <w:attr w:name="SourceValue" w:val="20"/>
-          <w:attr w:name="HasSpace" w:val="False"/>
-          <w:attr w:name="Negative" w:val="False"/>
-          <w:attr w:name="NumberType" w:val="1"/>
-          <w:attr w:name="TCSC" w:val="0"/>
         </w:smartTagPr>
         <w:r>
           <w:rPr>
@@ -20056,11 +20054,11 @@
       </w:r>
       <w:smartTag w:uri="urn:schemas-microsoft-com:office:smarttags" w:element="chsdate">
         <w:smartTagPr>
+          <w:attr w:name="IsROCDate" w:val="False"/>
+          <w:attr w:name="IsLunarDate" w:val="False"/>
+          <w:attr w:name="Day" w:val="30"/>
+          <w:attr w:name="Month" w:val="12"/>
           <w:attr w:name="Year" w:val="1899"/>
-          <w:attr w:name="Month" w:val="12"/>
-          <w:attr w:name="Day" w:val="30"/>
-          <w:attr w:name="IsLunarDate" w:val="False"/>
-          <w:attr w:name="IsROCDate" w:val="False"/>
         </w:smartTagPr>
         <w:r>
           <w:rPr>
@@ -20174,7 +20172,12 @@
       </w:r>
       <w:proofErr w:type="gramEnd"/>
       <w:r>
-        <w:t>，依契約變更程序經機關同意後辦理（廠商如於投標文件中建議其他合法土資場或借土區，並經機關審查同意者，亦可）。</w:t>
+        <w:t>，依契約變更程序經機關同意後辦理（廠商如於投標文件中建議其他合法土資場或借土區，並經機關審查</w:t>
+      </w:r>
+      <w:bookmarkStart w:id="2" w:name="_GoBack"/>
+      <w:bookmarkEnd w:id="2"/>
+      <w:r>
+        <w:t>同意者，亦可）。</w:t>
       </w:r>
     </w:p>
     <w:p>
@@ -20196,11 +20199,19 @@
         <w:rPr>
           <w:color w:val="0070C0"/>
         </w:rPr>
-        <w:t>(廿四)本案如有瀝青混凝土（AC）刨除者，其刨除料為機關所有，廠商應運送至機關指定處所</w:t>
+        <w:t>(廿四)</w:t>
+      </w:r>
+      <w:r>
+        <w:rPr>
+          <w:strike/>
+          <w:color w:val="0070C0"/>
+        </w:rPr>
+        <w:t>本案如有瀝青混凝土（AC）刨除者，其刨除料為機關所有，廠商應運送至機關指定處所</w:t>
       </w:r>
       <w:proofErr w:type="gramStart"/>
       <w:r>
         <w:rPr>
+          <w:strike/>
           <w:color w:val="0070C0"/>
         </w:rPr>
         <w:t>＿＿＿＿</w:t>
@@ -20208,6 +20219,7 @@
       <w:proofErr w:type="gramEnd"/>
       <w:r>
         <w:rPr>
+          <w:strike/>
           <w:color w:val="0070C0"/>
         </w:rPr>
         <w:t>（由機關於招標時載明）卸載，並由機關給付廠商運費。</w:t>
@@ -40926,12 +40938,12 @@
       </w:r>
       <w:smartTag w:uri="urn:schemas-microsoft-com:office:smarttags" w:element="chmetcnv">
         <w:smartTagPr>
+          <w:attr w:name="TCSC" w:val="0"/>
+          <w:attr w:name="NumberType" w:val="1"/>
+          <w:attr w:name="Negative" w:val="False"/>
+          <w:attr w:name="HasSpace" w:val="False"/>
+          <w:attr w:name="SourceValue" w:val="20"/>
           <w:attr w:name="UnitName" w:val="公尺"/>
-          <w:attr w:name="SourceValue" w:val="20"/>
-          <w:attr w:name="HasSpace" w:val="False"/>
-          <w:attr w:name="Negative" w:val="False"/>
-          <w:attr w:name="NumberType" w:val="1"/>
-          <w:attr w:name="TCSC" w:val="0"/>
         </w:smartTagPr>
         <w:r>
           <w:rPr>
@@ -41013,12 +41025,12 @@
       </w:r>
       <w:smartTag w:uri="urn:schemas-microsoft-com:office:smarttags" w:element="chmetcnv">
         <w:smartTagPr>
+          <w:attr w:name="TCSC" w:val="0"/>
+          <w:attr w:name="NumberType" w:val="1"/>
+          <w:attr w:name="Negative" w:val="False"/>
+          <w:attr w:name="HasSpace" w:val="False"/>
+          <w:attr w:name="SourceValue" w:val="75"/>
           <w:attr w:name="UnitName" w:val="公斤"/>
-          <w:attr w:name="SourceValue" w:val="75"/>
-          <w:attr w:name="HasSpace" w:val="False"/>
-          <w:attr w:name="Negative" w:val="False"/>
-          <w:attr w:name="NumberType" w:val="1"/>
-          <w:attr w:name="TCSC" w:val="0"/>
         </w:smartTagPr>
         <w:r>
           <w:rPr>
@@ -41087,12 +41099,12 @@
       </w:r>
       <w:smartTag w:uri="urn:schemas-microsoft-com:office:smarttags" w:element="chmetcnv">
         <w:smartTagPr>
+          <w:attr w:name="TCSC" w:val="0"/>
+          <w:attr w:name="NumberType" w:val="1"/>
+          <w:attr w:name="Negative" w:val="False"/>
+          <w:attr w:name="HasSpace" w:val="False"/>
+          <w:attr w:name="SourceValue" w:val="1.5"/>
           <w:attr w:name="UnitName" w:val="公尺"/>
-          <w:attr w:name="SourceValue" w:val="1.5"/>
-          <w:attr w:name="HasSpace" w:val="False"/>
-          <w:attr w:name="Negative" w:val="False"/>
-          <w:attr w:name="NumberType" w:val="1"/>
-          <w:attr w:name="TCSC" w:val="0"/>
         </w:smartTagPr>
         <w:r>
           <w:rPr>
@@ -44731,12 +44743,12 @@
       </w:r>
       <w:smartTag w:uri="urn:schemas-microsoft-com:office:smarttags" w:element="chmetcnv">
         <w:smartTagPr>
+          <w:attr w:name="TCSC" w:val="0"/>
+          <w:attr w:name="NumberType" w:val="1"/>
+          <w:attr w:name="Negative" w:val="False"/>
+          <w:attr w:name="HasSpace" w:val="False"/>
+          <w:attr w:name="SourceValue" w:val="500"/>
           <w:attr w:name="UnitName" w:val="公分"/>
-          <w:attr w:name="SourceValue" w:val="500"/>
-          <w:attr w:name="HasSpace" w:val="False"/>
-          <w:attr w:name="Negative" w:val="False"/>
-          <w:attr w:name="NumberType" w:val="1"/>
-          <w:attr w:name="TCSC" w:val="0"/>
         </w:smartTagPr>
         <w:r>
           <w:rPr>
@@ -44757,12 +44769,12 @@
       </w:r>
       <w:smartTag w:uri="urn:schemas-microsoft-com:office:smarttags" w:element="chmetcnv">
         <w:smartTagPr>
+          <w:attr w:name="TCSC" w:val="0"/>
+          <w:attr w:name="NumberType" w:val="1"/>
+          <w:attr w:name="Negative" w:val="False"/>
+          <w:attr w:name="HasSpace" w:val="False"/>
+          <w:attr w:name="SourceValue" w:val="320"/>
           <w:attr w:name="UnitName" w:val="公分"/>
-          <w:attr w:name="SourceValue" w:val="320"/>
-          <w:attr w:name="HasSpace" w:val="False"/>
-          <w:attr w:name="Negative" w:val="False"/>
-          <w:attr w:name="NumberType" w:val="1"/>
-          <w:attr w:name="TCSC" w:val="0"/>
         </w:smartTagPr>
         <w:r>
           <w:rPr>
@@ -44783,12 +44795,12 @@
       </w:r>
       <w:smartTag w:uri="urn:schemas-microsoft-com:office:smarttags" w:element="chmetcnv">
         <w:smartTagPr>
+          <w:attr w:name="TCSC" w:val="0"/>
+          <w:attr w:name="NumberType" w:val="1"/>
+          <w:attr w:name="Negative" w:val="False"/>
+          <w:attr w:name="HasSpace" w:val="False"/>
+          <w:attr w:name="SourceValue" w:val="170"/>
           <w:attr w:name="UnitName" w:val="公分"/>
-          <w:attr w:name="SourceValue" w:val="170"/>
-          <w:attr w:name="HasSpace" w:val="False"/>
-          <w:attr w:name="Negative" w:val="False"/>
-          <w:attr w:name="NumberType" w:val="1"/>
-          <w:attr w:name="TCSC" w:val="0"/>
         </w:smartTagPr>
         <w:r>
           <w:rPr>
@@ -44809,12 +44821,12 @@
       </w:r>
       <w:smartTag w:uri="urn:schemas-microsoft-com:office:smarttags" w:element="chmetcnv">
         <w:smartTagPr>
+          <w:attr w:name="TCSC" w:val="0"/>
+          <w:attr w:name="NumberType" w:val="1"/>
+          <w:attr w:name="Negative" w:val="False"/>
+          <w:attr w:name="HasSpace" w:val="False"/>
+          <w:attr w:name="SourceValue" w:val="120"/>
           <w:attr w:name="UnitName" w:val="公分"/>
-          <w:attr w:name="SourceValue" w:val="120"/>
-          <w:attr w:name="HasSpace" w:val="False"/>
-          <w:attr w:name="Negative" w:val="False"/>
-          <w:attr w:name="NumberType" w:val="1"/>
-          <w:attr w:name="TCSC" w:val="0"/>
         </w:smartTagPr>
         <w:r>
           <w:rPr>
@@ -44835,12 +44847,12 @@
       </w:r>
       <w:smartTag w:uri="urn:schemas-microsoft-com:office:smarttags" w:element="chmetcnv">
         <w:smartTagPr>
+          <w:attr w:name="TCSC" w:val="0"/>
+          <w:attr w:name="NumberType" w:val="1"/>
+          <w:attr w:name="Negative" w:val="False"/>
+          <w:attr w:name="HasSpace" w:val="False"/>
+          <w:attr w:name="SourceValue" w:val="75"/>
           <w:attr w:name="UnitName" w:val="公分"/>
-          <w:attr w:name="SourceValue" w:val="75"/>
-          <w:attr w:name="HasSpace" w:val="False"/>
-          <w:attr w:name="Negative" w:val="False"/>
-          <w:attr w:name="NumberType" w:val="1"/>
-          <w:attr w:name="TCSC" w:val="0"/>
         </w:smartTagPr>
         <w:r>
           <w:rPr>
@@ -50605,11 +50617,11 @@
       </w:r>
       <w:smartTag w:uri="urn:schemas-microsoft-com:office:smarttags" w:element="chsdate">
         <w:smartTagPr>
+          <w:attr w:name="IsROCDate" w:val="False"/>
+          <w:attr w:name="IsLunarDate" w:val="False"/>
+          <w:attr w:name="Day" w:val="30"/>
+          <w:attr w:name="Month" w:val="12"/>
           <w:attr w:name="Year" w:val="1899"/>
-          <w:attr w:name="Month" w:val="12"/>
-          <w:attr w:name="Day" w:val="30"/>
-          <w:attr w:name="IsLunarDate" w:val="False"/>
-          <w:attr w:name="IsROCDate" w:val="False"/>
         </w:smartTagPr>
         <w:r>
           <w:rPr>
@@ -52619,7 +52631,7 @@
         <w:rStyle w:val="a9"/>
         <w:noProof/>
       </w:rPr>
-      <w:t>22</w:t>
+      <w:t>20</w:t>
     </w:r>
     <w:r>
       <w:rPr>

</xml_diff>